<commit_message>
Z-Grenze Verdichter: Z > 0,65 nach Siemens Energy (statt 0,7 nach Q-017)
- einspeicherung_bausteine.py: Z_MIN = 0,65 mit Quelle (Siemens Energy
  Duisburg, E-Mail-Auskunft 08/2026, Zitat in den Annahmen); Q-017 (0,7)
  bleibt als strengerer Literaturrichtwert Z_Q017 zum Vergleich; gilt nur
  fuer Verdichterstufen, nicht fuer die Pumpe
- 03: Ausgabe zeigt beide Kriterien; Ergebnisse unveraendert
- 04 / phasenpfade_ergebnisse.json: Annahme Z_MIN = 0,65
- Dokumentation_S2_Gemisch.docx: Tabellen 1 und 2, Kap. 5.2, Hinweis reines
  CO2, Nachweis und offene Punkte angepasst

Co-Authored-By: Claude Opus 5.5 <noreply@anthropic.com>
Claude-Session: https://claude.ai/code/session_01FLRXDCKem3dbasHw8H8HkL
</commit_message>
<xml_diff>
--- a/Masterarbeit/Einspeicherung/Begleitstoffe_CO2/Dokumentation_S2_Gemisch.docx
+++ b/Masterarbeit/Einspeicherung/Begleitstoffe_CO2/Dokumentation_S2_Gemisch.docx
@@ -601,7 +601,7 @@
               <w:rPr>
                 <w:b w:val="0"/>
               </w:rPr>
-              <w:t>Stufe 2 ≤ 95 °C und Z ≥ 0,7 am Eintritt Stufe 2 (Kap. 5.2)</w:t>
+              <w:t xml:space="preserve">Stufe 2 ≤ 95 °C und Z &gt; 0,65 am Eintritt Stufe 2 (Kap. 5.2)</w:t>
             </w:r>
           </w:p>
         </w:tc>
@@ -735,7 +735,7 @@
               <w:rPr>
                 <w:b w:val="0"/>
               </w:rPr>
-              <w:t>≥ 0,7</w:t>
+              <w:t xml:space="preserve">&gt; 0,65</w:t>
             </w:r>
           </w:p>
         </w:tc>
@@ -751,7 +751,7 @@
               <w:rPr>
                 <w:b w:val="0"/>
               </w:rPr>
-              <w:t>Herstellerrichtwert [Q-017, S. 43]</w:t>
+              <w:t xml:space="preserve">Siemens Energy Duisburg, E-Mail-Auskunft 08/2026: Grenze der Laufradberechnung, gilt nur für Verdichter (nicht Pumpe); Literaturrichtwert ≥ 0,7 [Q-017, S. 43]</w:t>
             </w:r>
           </w:p>
         </w:tc>
@@ -1448,7 +1448,7 @@
               <w:rPr>
                 <w:b w:val="0"/>
               </w:rPr>
-              <w:t>Z ≥ 0,7 am Stufeneintritt</w:t>
+              <w:t xml:space="preserve">Z &gt; 0,65 am Stufeneintritt (Literatur: ≥ 0,7)</w:t>
             </w:r>
           </w:p>
         </w:tc>
@@ -1464,7 +1464,7 @@
               <w:rPr>
                 <w:b w:val="0"/>
               </w:rPr>
-              <w:t>[Q-017, S. 43]</w:t>
+              <w:t xml:space="preserve">Siemens Energy Duisburg, E-Mail-Auskunft 08/2026; [Q-017, S. 43]</w:t>
             </w:r>
           </w:p>
         </w:tc>
@@ -4091,7 +4091,7 @@
         <w:rPr>
           <w:b w:val="0"/>
         </w:rPr>
-        <w:t>Bei 20 °C Zwischenkühlung und gleichem Druckverhältnis in beiden Stufen liegt der Realgasfaktor am Eintritt der zweiten Stufe in allen Wegen bei 0,66–0,69, also unter dem Herstellerrichtwert 0,7 [Q-017, S. 43]. Mit 26 °C und 50 bar Zwischendruck wird er eingehalten, und die zweite Stufe bleibt unter 95 °C:</w:t>
+        <w:t xml:space="preserve">Bei 20 °C Zwischenkühlung und gleichem Druckverhältnis in beiden Stufen liegt der Realgasfaktor am Eintritt der zweiten Stufe in allen Wegen bei 0,66–0,69. Maßgebend ist die Grenze von Siemens Energy: Damit die Laufräder in den Berechnungsprogrammen des Herstellers zuverlässig ausgelegt werden können, muss Z über 0,65 liegen (E-Mail-Auskunft Siemens Energy Duisburg, 08/2026). Für die Pumpe gilt die Z-Grenze nicht – dort ist die Mindestdichte am Eintritt maßgebend. Die Siemens-Grenze ist auch bei 20 °C Zwischenkühlung erfüllt; den strengeren Literaturrichtwert 0,7 [Q-017, S. 43] erreicht die zweite Stufe erst ab etwa 25 °C. Mit der Zwischenkühlung auf 26 °C (Kühlwasser + 6 K) und 50 bar Zwischendruck werden beide eingehalten, und die zweite Stufe bleibt unter 95 °C:</w:t>
       </w:r>
     </w:p>
     <w:p>
@@ -5166,7 +5166,7 @@
         <w:rPr>
           <w:b w:val="0"/>
         </w:rPr>
-        <w:t>Bei reinem CO₂ ist das Verflüssigen bei niedrigem Druck (A) energetisch klar im Vorteil. Beim Gemisch muss A ohnehin bis 80 bar verdichten, der Vorteil schrumpft, und die Abhängigkeit vom Kühlwasser bleibt. Hinweis: Für reines CO₂ läge der Realgasfaktor vor Stufe 2 bei 50 bar / 26 °C mit 0,682 knapp unter 0,7; die Mappe für reines CO₂ rechnet weiter mit dem Weg über 60 bar.</w:t>
+        <w:t xml:space="preserve">Bei reinem CO₂ ist das Verflüssigen bei niedrigem Druck (A) energetisch klar im Vorteil. Beim Gemisch muss A ohnehin bis 80 bar verdichten, der Vorteil schrumpft, und die Abhängigkeit vom Kühlwasser bleibt. Hinweis: Für reines CO₂ läge der Realgasfaktor vor Stufe 2 bei 50 bar / 26 °C mit 0,682 über der Siemens-Grenze 0,65, aber knapp unter dem Literaturrichtwert 0,7; die Mappe für reines CO₂ rechnet weiter mit dem Weg über 60 bar.</w:t>
       </w:r>
     </w:p>
     <w:p>
@@ -6092,7 +6092,7 @@
               <w:rPr>
                 <w:b w:val="0"/>
               </w:rPr>
-              <w:t>≤ 95 °C ✔, Z ≥ 0,7 ✔</w:t>
+              <w:t xml:space="preserve">≤ 95 °C ✔, Z &gt; 0,65 ✔ (auch ≥ 0,7)</w:t>
             </w:r>
           </w:p>
         </w:tc>
@@ -6445,7 +6445,7 @@
         <w:rPr>
           <w:b w:val="0"/>
         </w:rPr>
-        <w:t xml:space="preserve"> Mindestdichte und Saugdruckzuschlag der Pumpe [Q-121, S. 2]; Wirkungsgrad über der Saugtemperatur [Q-121, S. 3]; Dichtungskonzept mit N₂/H₂ [Q-120, Folien 46, 80]; Z-Grenze und Stufung des Verdichters [Q-017]; optimaler Druck zwischen Verdichter und Pumpe (85–91 bar) [Q-121, S. 2]; Anfahren erst ab Mindestdichte [Q-121, S. 4].</w:t>
+        <w:t xml:space="preserve"> Mindestdichte und Saugdruckzuschlag der Pumpe [Q-121, S. 2]; Wirkungsgrad über der Saugtemperatur [Q-121, S. 3]; Dichtungskonzept mit N₂/H₂ [Q-120, Folien 46, 80]; Stufung des Verdichters für das Gemisch [Q-017] (Z-Grenze &gt; 0,65 von Siemens Energy bereits bestätigt, E-Mail 08/2026); optimaler Druck zwischen Verdichter und Pumpe (85–91 bar) [Q-121, S. 2]; Anfahren erst ab Mindestdichte [Q-121, S. 4].</w:t>
       </w:r>
     </w:p>
     <w:p>

</xml_diff>

<commit_message>
Begleitstoffe_CO2: README mit Skriptuebersicht, Dateitabellen der Dokus ergaenzt
Entwurf zur Abstimmung, noch nicht auf main.

Co-Authored-By: Claude Opus 5.5 <noreply@anthropic.com>
Claude-Session: https://claude.ai/code/session_01FLRXDCKem3dbasHw8H8HkL
</commit_message>
<xml_diff>
--- a/Masterarbeit/Einspeicherung/Begleitstoffe_CO2/Dokumentation_S2_Gemisch.docx
+++ b/Masterarbeit/Einspeicherung/Begleitstoffe_CO2/Dokumentation_S2_Gemisch.docx
@@ -6539,6 +6539,40 @@
               <w:rPr>
                 <w:b w:val="0"/>
               </w:rPr>
+              <w:t xml:space="preserve">gemisch_worstcase.py</w:t>
+            </w:r>
+          </w:p>
+        </w:tc>
+        <w:tc>
+          <w:tcPr>
+            <w:tcW w:type="dxa" w:w="5669"/>
+          </w:tcPr>
+          <w:p>
+            <w:pPr>
+              <w:pStyle w:val="Compact"/>
+            </w:pPr>
+            <w:r>
+              <w:rPr>
+                <w:b w:val="0"/>
+              </w:rPr>
+              <w:t xml:space="preserve">Stoffdatenblatt des Gemischs: Zusammensetzung, Stoffwerte, Phasengrenze (Grundlage aller Skripte, siehe Dokumentation Stoffmodelle)</w:t>
+            </w:r>
+          </w:p>
+        </w:tc>
+      </w:tr>
+      <w:tr>
+        <w:tc>
+          <w:tcPr>
+            <w:tcW w:type="dxa" w:w="3402"/>
+          </w:tcPr>
+          <w:p>
+            <w:pPr>
+              <w:pStyle w:val="Compact"/>
+            </w:pPr>
+            <w:r>
+              <w:rPr>
+                <w:b w:val="0"/>
+              </w:rPr>
               <w:t>einspeicherung_bausteine.py</w:t>
             </w:r>
           </w:p>
@@ -6658,6 +6692,40 @@
                 <w:b w:val="0"/>
               </w:rPr>
               <w:t>Blatt „Einspeicherung S2“: Rechnung des gewählten Wegs, kurzer Vergleich der Wege, Phasendiagramm</w:t>
+            </w:r>
+          </w:p>
+        </w:tc>
+      </w:tr>
+      <w:tr>
+        <w:tc>
+          <w:tcPr>
+            <w:tcW w:type="dxa" w:w="3402"/>
+          </w:tcPr>
+          <w:p>
+            <w:pPr>
+              <w:pStyle w:val="Compact"/>
+            </w:pPr>
+            <w:r>
+              <w:rPr>
+                <w:b w:val="0"/>
+              </w:rPr>
+              <w:t xml:space="preserve">README.md</w:t>
+            </w:r>
+          </w:p>
+        </w:tc>
+        <w:tc>
+          <w:tcPr>
+            <w:tcW w:type="dxa" w:w="5669"/>
+          </w:tcPr>
+          <w:p>
+            <w:pPr>
+              <w:pStyle w:val="Compact"/>
+            </w:pPr>
+            <w:r>
+              <w:rPr>
+                <w:b w:val="0"/>
+              </w:rPr>
+              <w:t xml:space="preserve">Übersicht aller Skripte im Ordner Begleitstoffe_CO2: was sie machen, was sie brauchen, welche Abbildungen sie erzeugen</w:t>
             </w:r>
           </w:p>
         </w:tc>

</xml_diff>

<commit_message>
Begleitstoffe_CO2: README, Dateitabellen und aktuelle Betriebspunkte
- README.md: Uebersicht aller Skripte (was sie machen, was sie brauchen,
  was sie erzeugen), Regel Skript = Excel, Abhaengigkeit Kaverne
- 01_phasendiagramm_rein_vs_gemisch.py: Betriebspunkte aus
  einspeicherung_bausteine.py (50 bar / 26 degC nach Zwischenkuehler,
  91 bar / 26 degC nach Kuehler); frueherer Kuehleraustritt 80 bar / 25 degC
  grau als verworfen; Abbildung neu erzeugt
- Dokumentation_Stoffmodelle_Validierung_v2.docx: Abbildung 1, Kurzfassung,
  Tabelle 9.2 und Kap. 9.3 auf die aktuellen Betriebspunkte; Dateitabelle
  ergaenzt
- Dokumentation_S2_Gemisch.docx: Dateitabelle ergaenzt

Co-Authored-By: Claude Opus 5.5 <noreply@anthropic.com>
Claude-Session: https://claude.ai/code/session_01FLRXDCKem3dbasHw8H8HkL
</commit_message>
<xml_diff>
--- a/Masterarbeit/Einspeicherung/Begleitstoffe_CO2/Dokumentation_S2_Gemisch.docx
+++ b/Masterarbeit/Einspeicherung/Begleitstoffe_CO2/Dokumentation_S2_Gemisch.docx
@@ -6539,6 +6539,40 @@
               <w:rPr>
                 <w:b w:val="0"/>
               </w:rPr>
+              <w:t xml:space="preserve">gemisch_worstcase.py</w:t>
+            </w:r>
+          </w:p>
+        </w:tc>
+        <w:tc>
+          <w:tcPr>
+            <w:tcW w:type="dxa" w:w="5669"/>
+          </w:tcPr>
+          <w:p>
+            <w:pPr>
+              <w:pStyle w:val="Compact"/>
+            </w:pPr>
+            <w:r>
+              <w:rPr>
+                <w:b w:val="0"/>
+              </w:rPr>
+              <w:t xml:space="preserve">Stoffdatenblatt des Gemischs: Zusammensetzung, Stoffwerte, Phasengrenze (Grundlage aller Skripte, siehe Dokumentation Stoffmodelle)</w:t>
+            </w:r>
+          </w:p>
+        </w:tc>
+      </w:tr>
+      <w:tr>
+        <w:tc>
+          <w:tcPr>
+            <w:tcW w:type="dxa" w:w="3402"/>
+          </w:tcPr>
+          <w:p>
+            <w:pPr>
+              <w:pStyle w:val="Compact"/>
+            </w:pPr>
+            <w:r>
+              <w:rPr>
+                <w:b w:val="0"/>
+              </w:rPr>
               <w:t>einspeicherung_bausteine.py</w:t>
             </w:r>
           </w:p>
@@ -6658,6 +6692,40 @@
                 <w:b w:val="0"/>
               </w:rPr>
               <w:t>Blatt „Einspeicherung S2“: Rechnung des gewählten Wegs, kurzer Vergleich der Wege, Phasendiagramm</w:t>
+            </w:r>
+          </w:p>
+        </w:tc>
+      </w:tr>
+      <w:tr>
+        <w:tc>
+          <w:tcPr>
+            <w:tcW w:type="dxa" w:w="3402"/>
+          </w:tcPr>
+          <w:p>
+            <w:pPr>
+              <w:pStyle w:val="Compact"/>
+            </w:pPr>
+            <w:r>
+              <w:rPr>
+                <w:b w:val="0"/>
+              </w:rPr>
+              <w:t xml:space="preserve">README.md</w:t>
+            </w:r>
+          </w:p>
+        </w:tc>
+        <w:tc>
+          <w:tcPr>
+            <w:tcW w:type="dxa" w:w="5669"/>
+          </w:tcPr>
+          <w:p>
+            <w:pPr>
+              <w:pStyle w:val="Compact"/>
+            </w:pPr>
+            <w:r>
+              <w:rPr>
+                <w:b w:val="0"/>
+              </w:rPr>
+              <w:t xml:space="preserve">Übersicht aller Skripte im Ordner Begleitstoffe_CO2: was sie machen, was sie brauchen, welche Abbildungen sie erzeugen</w:t>
             </w:r>
           </w:p>
         </w:tc>

</xml_diff>